<commit_message>
docs: refresh README and Word doc for this session's changes
Updates the documentation to reflect everything shipped since it was
originally written: the gallery permission fix (session-derived identity),
bank-details placeholder fix, dues-payment/donation email notifications on
the Stripe webhook, the local dev-middleware bodyParser fix, the new
Barbados Clubs admin feature (table, API route, admin tab, modal), and the
removal of the /directory route and its nav entries.

Also corrects the Vercel function count (now exactly 12 of 12 on the Hobby
plan with the new barbados-clubs.js route) and notes the remaining known
issue that real bank details still exist in git history despite the
source-level fix.

Co-Authored-By: Claude Sonnet 5 <noreply@anthropic.com>
</commit_message>
<xml_diff>
--- a/docs/Progressive-Optimist-Club-Documentation.docx
+++ b/docs/Progressive-Optimist-Club-Documentation.docx
@@ -160,7 +160,7 @@
           <w:sz w:val="20"/>
           <w:szCs w:val="20"/>
         </w:rPr>
-        <w:t xml:space="preserve">A single-page React application that serves as the public website, member portal, and administrative console for the Progressive Optimist Club of Barbados. It combines a public marketing/outreach site with an authenticated members' area (dues, projects, gallery, directory, documents) and a role-gated admin console for officers.</w:t>
+        <w:t xml:space="preserve">A single-page React application that serves as the public website, member portal, and administrative console for the Progressive Optimist Club of Barbados. It combines a public marketing/outreach site with an authenticated members' area (dues, projects, gallery, document library) and a role-gated admin console for officers.</w:t>
       </w:r>
     </w:p>
     <w:p>
@@ -687,7 +687,7 @@
                 <w:sz w:val="18"/>
                 <w:szCs w:val="18"/>
               </w:rPr>
-              <w:t xml:space="preserve">Site variables, member permissions, treasurer dues console, project moderation.</w:t>
+              <w:t xml:space="preserve">Site variables, member permissions, treasurer dues console, project moderation, Barbados clubs directory management.</w:t>
             </w:r>
           </w:p>
         </w:tc>
@@ -967,7 +967,50 @@
           <w:sz w:val="20"/>
           <w:szCs w:val="20"/>
         </w:rPr>
-        <w:t xml:space="preserve"> — the contact form and all transactional email go out through AWS SES, with a non-production redirect safeguard.</w:t>
+        <w:t xml:space="preserve"> — the contact form, password links, and all transactional email go out through AWS SES, with a non-production redirect safeguard. The Stripe webhook additionally emails the club's configured contact address whenever a dues payment or donation settles.</w:t>
+      </w:r>
+    </w:p>
+    <w:p>
+      <w:pPr>
+        <w:pStyle w:val="ListParagraph"/>
+        <w:numPr>
+          <w:ilvl w:val="0"/>
+          <w:numId w:val="2"/>
+        </w:numPr>
+        <w:spacing w:after="80"/>
+      </w:pPr>
+      <w:r>
+        <w:rPr>
+          <w:b/>
+          <w:bCs/>
+          <w:sz w:val="20"/>
+          <w:szCs w:val="20"/>
+        </w:rPr>
+        <w:t xml:space="preserve">Barbados club directory</w:t>
+      </w:r>
+      <w:r>
+        <w:rPr>
+          <w:sz w:val="20"/>
+          <w:szCs w:val="20"/>
+        </w:rPr>
+        <w:t xml:space="preserve"> — admins add/edit/delete entries from the admin console; the public </w:t>
+      </w:r>
+      <w:r>
+        <w:rPr>
+          <w:rFonts w:ascii="Consolas" w:cs="Consolas" w:eastAsia="Consolas" w:hAnsi="Consolas"/>
+          <w:color w:val="B91C1C"/>
+          <w:sz w:val="20"/>
+          <w:szCs w:val="20"/>
+          <w:shd w:fill="F1F5F9" w:val="clear"/>
+        </w:rPr>
+        <w:t xml:space="preserve">/barbados-clubs</w:t>
+      </w:r>
+      <w:r>
+        <w:rPr>
+          <w:sz w:val="20"/>
+          <w:szCs w:val="20"/>
+        </w:rPr>
+        <w:t xml:space="preserve"> page reads the same database table, so there is no static content to redeploy for a listing change.</w:t>
       </w:r>
     </w:p>
     <w:p>
@@ -1882,7 +1925,7 @@
           <w:sz w:val="16"/>
           <w:szCs w:val="16"/>
         </w:rPr>
-        <w:t xml:space="preserve">│   ├── send-contact-message.js # contact form → SES</w:t>
+        <w:t xml:space="preserve">│   ├── barbados-clubs.js       # public list / admin add-update-delete of club directory</w:t>
       </w:r>
     </w:p>
     <w:p>
@@ -1898,7 +1941,7 @@
           <w:sz w:val="16"/>
           <w:szCs w:val="16"/>
         </w:rPr>
-        <w:t xml:space="preserve">│   ├── create-checkout-session.js       # Stripe donation checkout</w:t>
+        <w:t xml:space="preserve">│   ├── send-contact-message.js # contact form → SES</w:t>
       </w:r>
     </w:p>
     <w:p>
@@ -1914,7 +1957,7 @@
           <w:sz w:val="16"/>
           <w:szCs w:val="16"/>
         </w:rPr>
-        <w:t xml:space="preserve">│   ├── create-dues-checkout-session.js  # Stripe dues checkout (itemised, + card fee)</w:t>
+        <w:t xml:space="preserve">│   ├── create-checkout-session.js       # Stripe donation checkout</w:t>
       </w:r>
     </w:p>
     <w:p>
@@ -1930,7 +1973,7 @@
           <w:sz w:val="16"/>
           <w:szCs w:val="16"/>
         </w:rPr>
-        <w:t xml:space="preserve">│   └── stripe-webhook.js       # payment confirmation → database</w:t>
+        <w:t xml:space="preserve">│   ├── create-dues-checkout-session.js  # Stripe dues checkout (itemised, + card fee)</w:t>
       </w:r>
     </w:p>
     <w:p>
@@ -1946,7 +1989,7 @@
           <w:sz w:val="16"/>
           <w:szCs w:val="16"/>
         </w:rPr>
-        <w:t xml:space="preserve">│</w:t>
+        <w:t xml:space="preserve">│   └── stripe-webhook.js       # payment confirmation → database</w:t>
       </w:r>
     </w:p>
     <w:p>
@@ -1962,7 +2005,7 @@
           <w:sz w:val="16"/>
           <w:szCs w:val="16"/>
         </w:rPr>
-        <w:t xml:space="preserve">├── lib/                        # Shared server helpers (deliberately OUTSIDE /api, since</w:t>
+        <w:t xml:space="preserve">│</w:t>
       </w:r>
     </w:p>
     <w:p>
@@ -1978,7 +2021,7 @@
           <w:sz w:val="16"/>
           <w:szCs w:val="16"/>
         </w:rPr>
-        <w:t xml:space="preserve">│   │                           # Vercel turns every file under /api into a function)</w:t>
+        <w:t xml:space="preserve">├── lib/                        # Shared server helpers (deliberately OUTSIDE /api, since</w:t>
       </w:r>
     </w:p>
     <w:p>
@@ -1994,7 +2037,7 @@
           <w:sz w:val="16"/>
           <w:szCs w:val="16"/>
         </w:rPr>
-        <w:t xml:space="preserve">│   ├── db.js                   # Neon client, access tiers, dues rate, guards</w:t>
+        <w:t xml:space="preserve">│   │                           # Vercel turns every file under /api into a function)</w:t>
       </w:r>
     </w:p>
     <w:p>
@@ -2010,7 +2053,7 @@
           <w:sz w:val="16"/>
           <w:szCs w:val="16"/>
         </w:rPr>
-        <w:t xml:space="preserve">│   ├── session.js              # signed session tokens, requireAccess guard</w:t>
+        <w:t xml:space="preserve">│   ├── db.js                   # Neon client, access tiers, dues rate, guards</w:t>
       </w:r>
     </w:p>
     <w:p>
@@ -2026,7 +2069,7 @@
           <w:sz w:val="16"/>
           <w:szCs w:val="16"/>
         </w:rPr>
-        <w:t xml:space="preserve">│   ├── email.js                # SES sender + non-production redirect</w:t>
+        <w:t xml:space="preserve">│   ├── session.js              # signed session tokens, requireAccess guard</w:t>
       </w:r>
     </w:p>
     <w:p>
@@ -2042,7 +2085,7 @@
           <w:sz w:val="16"/>
           <w:szCs w:val="16"/>
         </w:rPr>
-        <w:t xml:space="preserve">│   ├── password.js             # unambiguous random password generator</w:t>
+        <w:t xml:space="preserve">│   ├── email.js                # SES sender + non-production redirect</w:t>
       </w:r>
     </w:p>
     <w:p>
@@ -2058,7 +2101,7 @@
           <w:sz w:val="16"/>
           <w:szCs w:val="16"/>
         </w:rPr>
-        <w:t xml:space="preserve">│   └── roles.js                # canonical roles + default avatars (browser-safe)</w:t>
+        <w:t xml:space="preserve">│   ├── password.js             # unambiguous random password generator</w:t>
       </w:r>
     </w:p>
     <w:p>
@@ -2074,7 +2117,7 @@
           <w:sz w:val="16"/>
           <w:szCs w:val="16"/>
         </w:rPr>
-        <w:t xml:space="preserve">│</w:t>
+        <w:t xml:space="preserve">│   └── roles.js                # canonical roles + default avatars (browser-safe)</w:t>
       </w:r>
     </w:p>
     <w:p>
@@ -2090,7 +2133,7 @@
           <w:sz w:val="16"/>
           <w:szCs w:val="16"/>
         </w:rPr>
-        <w:t xml:space="preserve">├── src/</w:t>
+        <w:t xml:space="preserve">│</w:t>
       </w:r>
     </w:p>
     <w:p>
@@ -2106,7 +2149,7 @@
           <w:sz w:val="16"/>
           <w:szCs w:val="16"/>
         </w:rPr>
-        <w:t xml:space="preserve">│   ├── App.jsx                 # Router, error boundary, global post modal</w:t>
+        <w:t xml:space="preserve">├── src/</w:t>
       </w:r>
     </w:p>
     <w:p>
@@ -2122,7 +2165,7 @@
           <w:sz w:val="16"/>
           <w:szCs w:val="16"/>
         </w:rPr>
-        <w:t xml:space="preserve">│   ├── context/AuthContext.jsx # Central state store + all API calls (~1.4k lines)</w:t>
+        <w:t xml:space="preserve">│   ├── App.jsx                 # Router, error boundary, global post modal</w:t>
       </w:r>
     </w:p>
     <w:p>
@@ -2138,7 +2181,23 @@
           <w:sz w:val="16"/>
           <w:szCs w:val="16"/>
         </w:rPr>
-        <w:t xml:space="preserve">│   ├── components/             # Navbar, Footer, project cards/modals, creed, hierarchy</w:t>
+        <w:t xml:space="preserve">│   ├── context/AuthContext.jsx # Central state store + all API calls (~1.5k lines)</w:t>
+      </w:r>
+    </w:p>
+    <w:p>
+      <w:pPr>
+        <w:shd w:fill="F1F5F9" w:val="clear"/>
+        <w:spacing w:after="0" w:before="0"/>
+        <w:ind w:left="200" w:right="200"/>
+      </w:pPr>
+      <w:r>
+        <w:rPr>
+          <w:rFonts w:ascii="Consolas" w:cs="Consolas" w:eastAsia="Consolas" w:hAnsi="Consolas"/>
+          <w:color w:val="1E293B"/>
+          <w:sz w:val="16"/>
+          <w:szCs w:val="16"/>
+        </w:rPr>
+        <w:t xml:space="preserve">│   ├── components/             # Navbar, Footer, project/club modals, creed, hierarchy</w:t>
       </w:r>
     </w:p>
     <w:p>
@@ -2658,7 +2717,41 @@
           <w:sz w:val="20"/>
           <w:szCs w:val="20"/>
         </w:rPr>
-        <w:t xml:space="preserve"> shim close enough to Vercel's. Without it the dev server would return handler source code instead of running it.</w:t>
+        <w:t xml:space="preserve"> shim close enough to Vercel's. Without it the dev server would return handler source code instead of running it. The middleware also honours a route's own </w:t>
+      </w:r>
+      <w:r>
+        <w:rPr>
+          <w:rFonts w:ascii="Consolas" w:cs="Consolas" w:eastAsia="Consolas" w:hAnsi="Consolas"/>
+          <w:color w:val="B91C1C"/>
+          <w:sz w:val="20"/>
+          <w:szCs w:val="20"/>
+          <w:shd w:fill="F1F5F9" w:val="clear"/>
+        </w:rPr>
+        <w:t xml:space="preserve">config.api.bodyParser = false</w:t>
+      </w:r>
+      <w:r>
+        <w:rPr>
+          <w:sz w:val="20"/>
+          <w:szCs w:val="20"/>
+        </w:rPr>
+        <w:t xml:space="preserve"> export (used by </w:t>
+      </w:r>
+      <w:r>
+        <w:rPr>
+          <w:rFonts w:ascii="Consolas" w:cs="Consolas" w:eastAsia="Consolas" w:hAnsi="Consolas"/>
+          <w:color w:val="B91C1C"/>
+          <w:sz w:val="20"/>
+          <w:szCs w:val="20"/>
+          <w:shd w:fill="F1F5F9" w:val="clear"/>
+        </w:rPr>
+        <w:t xml:space="preserve">stripe-webhook.js</w:t>
+      </w:r>
+      <w:r>
+        <w:rPr>
+          <w:sz w:val="20"/>
+          <w:szCs w:val="20"/>
+        </w:rPr>
+        <w:t xml:space="preserve">) by skipping body pre-parsing for it — reading the body first would drain the stream before the handler's own raw-body reader ever attaches, which is exactly what broke local webhook testing before this was fixed.</w:t>
       </w:r>
     </w:p>
     <w:p>
@@ -3063,7 +3156,7 @@
                 <w:sz w:val="18"/>
                 <w:szCs w:val="18"/>
               </w:rPr>
-              <w:t xml:space="preserve">BarbadosClubsPage — sister clubs</w:t>
+              <w:t xml:space="preserve">BarbadosClubsPage — sister clubs, admin-editable via the database</w:t>
             </w:r>
           </w:p>
         </w:tc>
@@ -3161,80 +3254,6 @@
                 <w:szCs w:val="18"/>
               </w:rPr>
               <w:t xml:space="preserve">Public</w:t>
-            </w:r>
-          </w:p>
-        </w:tc>
-      </w:tr>
-      <w:tr>
-        <w:tc>
-          <w:tcPr>
-            <w:tcW w:type="dxa" w:w="3120"/>
-            <w:tcMar>
-              <w:top w:type="dxa" w:w="60"/>
-              <w:left w:type="dxa" w:w="100"/>
-              <w:bottom w:type="dxa" w:w="60"/>
-              <w:right w:type="dxa" w:w="100"/>
-            </w:tcMar>
-          </w:tcPr>
-          <w:p>
-            <w:pPr>
-              <w:spacing w:after="20" w:before="20"/>
-            </w:pPr>
-            <w:r>
-              <w:rPr>
-                <w:rFonts w:ascii="Consolas" w:cs="Consolas" w:eastAsia="Consolas" w:hAnsi="Consolas"/>
-                <w:color w:val="B91C1C"/>
-                <w:sz w:val="18"/>
-                <w:szCs w:val="18"/>
-                <w:shd w:fill="F1F5F9" w:val="clear"/>
-              </w:rPr>
-              <w:t xml:space="preserve">/directory</w:t>
-            </w:r>
-          </w:p>
-        </w:tc>
-        <w:tc>
-          <w:tcPr>
-            <w:tcW w:type="dxa" w:w="3120"/>
-            <w:tcMar>
-              <w:top w:type="dxa" w:w="60"/>
-              <w:left w:type="dxa" w:w="100"/>
-              <w:bottom w:type="dxa" w:w="60"/>
-              <w:right w:type="dxa" w:w="100"/>
-            </w:tcMar>
-          </w:tcPr>
-          <w:p>
-            <w:pPr>
-              <w:spacing w:after="20" w:before="20"/>
-            </w:pPr>
-            <w:r>
-              <w:rPr>
-                <w:sz w:val="18"/>
-                <w:szCs w:val="18"/>
-              </w:rPr>
-              <w:t xml:space="preserve">MembershipDirectoryPage — roster (detail level depends on session)</w:t>
-            </w:r>
-          </w:p>
-        </w:tc>
-        <w:tc>
-          <w:tcPr>
-            <w:tcW w:type="dxa" w:w="3120"/>
-            <w:tcMar>
-              <w:top w:type="dxa" w:w="60"/>
-              <w:left w:type="dxa" w:w="100"/>
-              <w:bottom w:type="dxa" w:w="60"/>
-              <w:right w:type="dxa" w:w="100"/>
-            </w:tcMar>
-          </w:tcPr>
-          <w:p>
-            <w:pPr>
-              <w:spacing w:after="20" w:before="20"/>
-            </w:pPr>
-            <w:r>
-              <w:rPr>
-                <w:sz w:val="18"/>
-                <w:szCs w:val="18"/>
-              </w:rPr>
-              <w:t xml:space="preserve">Public / enriched</w:t>
             </w:r>
           </w:p>
         </w:tc>
@@ -3793,6 +3812,23 @@
           <w:szCs w:val="20"/>
         </w:rPr>
         <w:t xml:space="preserve"> · </w:t>
+      </w:r>
+      <w:r>
+        <w:rPr>
+          <w:rFonts w:ascii="Consolas" w:cs="Consolas" w:eastAsia="Consolas" w:hAnsi="Consolas"/>
+          <w:color w:val="B91C1C"/>
+          <w:sz w:val="20"/>
+          <w:szCs w:val="20"/>
+          <w:shd w:fill="F1F5F9" w:val="clear"/>
+        </w:rPr>
+        <w:t xml:space="preserve">clubs</w:t>
+      </w:r>
+      <w:r>
+        <w:rPr>
+          <w:sz w:val="20"/>
+          <w:szCs w:val="20"/>
+        </w:rPr>
+        <w:t xml:space="preserve"> (Barbados club directory) · </w:t>
       </w:r>
       <w:r>
         <w:rPr>
@@ -5136,6 +5172,54 @@
                 <w:sz w:val="18"/>
                 <w:szCs w:val="18"/>
               </w:rPr>
+              <w:t xml:space="preserve">Upload a gallery photo</w:t>
+            </w:r>
+          </w:p>
+        </w:tc>
+        <w:tc>
+          <w:tcPr>
+            <w:tcW w:type="dxa" w:w="4680"/>
+            <w:tcMar>
+              <w:top w:type="dxa" w:w="60"/>
+              <w:left w:type="dxa" w:w="100"/>
+              <w:bottom w:type="dxa" w:w="60"/>
+              <w:right w:type="dxa" w:w="100"/>
+            </w:tcMar>
+          </w:tcPr>
+          <w:p>
+            <w:pPr>
+              <w:spacing w:after="20" w:before="20"/>
+            </w:pPr>
+            <w:r>
+              <w:rPr>
+                <w:sz w:val="18"/>
+                <w:szCs w:val="18"/>
+              </w:rPr>
+              <w:t xml:space="preserve">Any valid session</w:t>
+            </w:r>
+          </w:p>
+        </w:tc>
+      </w:tr>
+      <w:tr>
+        <w:tc>
+          <w:tcPr>
+            <w:tcW w:type="dxa" w:w="4680"/>
+            <w:tcMar>
+              <w:top w:type="dxa" w:w="60"/>
+              <w:left w:type="dxa" w:w="100"/>
+              <w:bottom w:type="dxa" w:w="60"/>
+              <w:right w:type="dxa" w:w="100"/>
+            </w:tcMar>
+          </w:tcPr>
+          <w:p>
+            <w:pPr>
+              <w:spacing w:after="20" w:before="20"/>
+            </w:pPr>
+            <w:r>
+              <w:rPr>
+                <w:sz w:val="18"/>
+                <w:szCs w:val="18"/>
+              </w:rPr>
               <w:t xml:space="preserve">Delete a gallery photo</w:t>
             </w:r>
           </w:p>
@@ -5156,10 +5240,156 @@
             </w:pPr>
             <w:r>
               <w:rPr>
-                <w:sz w:val="18"/>
-                <w:szCs w:val="18"/>
-              </w:rPr>
-              <w:t xml:space="preserve">Admin/finance tiers, or the original uploader</w:t>
+                <w:rFonts w:ascii="Consolas" w:cs="Consolas" w:eastAsia="Consolas" w:hAnsi="Consolas"/>
+                <w:color w:val="B91C1C"/>
+                <w:sz w:val="18"/>
+                <w:szCs w:val="18"/>
+                <w:shd w:fill="F1F5F9" w:val="clear"/>
+              </w:rPr>
+              <w:t xml:space="preserve">super admin</w:t>
+            </w:r>
+            <w:r>
+              <w:rPr>
+                <w:sz w:val="18"/>
+                <w:szCs w:val="18"/>
+              </w:rPr>
+              <w:t xml:space="preserve">, </w:t>
+            </w:r>
+            <w:r>
+              <w:rPr>
+                <w:rFonts w:ascii="Consolas" w:cs="Consolas" w:eastAsia="Consolas" w:hAnsi="Consolas"/>
+                <w:color w:val="B91C1C"/>
+                <w:sz w:val="18"/>
+                <w:szCs w:val="18"/>
+                <w:shd w:fill="F1F5F9" w:val="clear"/>
+              </w:rPr>
+              <w:t xml:space="preserve">finance</w:t>
+            </w:r>
+            <w:r>
+              <w:rPr>
+                <w:sz w:val="18"/>
+                <w:szCs w:val="18"/>
+              </w:rPr>
+              <w:t xml:space="preserve">, </w:t>
+            </w:r>
+            <w:r>
+              <w:rPr>
+                <w:rFonts w:ascii="Consolas" w:cs="Consolas" w:eastAsia="Consolas" w:hAnsi="Consolas"/>
+                <w:color w:val="B91C1C"/>
+                <w:sz w:val="18"/>
+                <w:szCs w:val="18"/>
+                <w:shd w:fill="F1F5F9" w:val="clear"/>
+              </w:rPr>
+              <w:t xml:space="preserve">admin</w:t>
+            </w:r>
+            <w:r>
+              <w:rPr>
+                <w:sz w:val="18"/>
+                <w:szCs w:val="18"/>
+              </w:rPr>
+              <w:t xml:space="preserve">, or the original uploader (by session </w:t>
+            </w:r>
+            <w:r>
+              <w:rPr>
+                <w:rFonts w:ascii="Consolas" w:cs="Consolas" w:eastAsia="Consolas" w:hAnsi="Consolas"/>
+                <w:color w:val="B91C1C"/>
+                <w:sz w:val="18"/>
+                <w:szCs w:val="18"/>
+                <w:shd w:fill="F1F5F9" w:val="clear"/>
+              </w:rPr>
+              <w:t xml:space="preserve">memberId</w:t>
+            </w:r>
+            <w:r>
+              <w:rPr>
+                <w:sz w:val="18"/>
+                <w:szCs w:val="18"/>
+              </w:rPr>
+              <w:t xml:space="preserve">)</w:t>
+            </w:r>
+          </w:p>
+        </w:tc>
+      </w:tr>
+      <w:tr>
+        <w:tc>
+          <w:tcPr>
+            <w:tcW w:type="dxa" w:w="4680"/>
+            <w:tcMar>
+              <w:top w:type="dxa" w:w="60"/>
+              <w:left w:type="dxa" w:w="100"/>
+              <w:bottom w:type="dxa" w:w="60"/>
+              <w:right w:type="dxa" w:w="100"/>
+            </w:tcMar>
+          </w:tcPr>
+          <w:p>
+            <w:pPr>
+              <w:spacing w:after="20" w:before="20"/>
+            </w:pPr>
+            <w:r>
+              <w:rPr>
+                <w:sz w:val="18"/>
+                <w:szCs w:val="18"/>
+              </w:rPr>
+              <w:t xml:space="preserve">Add / edit / delete a Barbados club listing</w:t>
+            </w:r>
+          </w:p>
+        </w:tc>
+        <w:tc>
+          <w:tcPr>
+            <w:tcW w:type="dxa" w:w="4680"/>
+            <w:tcMar>
+              <w:top w:type="dxa" w:w="60"/>
+              <w:left w:type="dxa" w:w="100"/>
+              <w:bottom w:type="dxa" w:w="60"/>
+              <w:right w:type="dxa" w:w="100"/>
+            </w:tcMar>
+          </w:tcPr>
+          <w:p>
+            <w:pPr>
+              <w:spacing w:after="20" w:before="20"/>
+            </w:pPr>
+            <w:r>
+              <w:rPr>
+                <w:rFonts w:ascii="Consolas" w:cs="Consolas" w:eastAsia="Consolas" w:hAnsi="Consolas"/>
+                <w:color w:val="B91C1C"/>
+                <w:sz w:val="18"/>
+                <w:szCs w:val="18"/>
+                <w:shd w:fill="F1F5F9" w:val="clear"/>
+              </w:rPr>
+              <w:t xml:space="preserve">super admin</w:t>
+            </w:r>
+            <w:r>
+              <w:rPr>
+                <w:sz w:val="18"/>
+                <w:szCs w:val="18"/>
+              </w:rPr>
+              <w:t xml:space="preserve">, </w:t>
+            </w:r>
+            <w:r>
+              <w:rPr>
+                <w:rFonts w:ascii="Consolas" w:cs="Consolas" w:eastAsia="Consolas" w:hAnsi="Consolas"/>
+                <w:color w:val="B91C1C"/>
+                <w:sz w:val="18"/>
+                <w:szCs w:val="18"/>
+                <w:shd w:fill="F1F5F9" w:val="clear"/>
+              </w:rPr>
+              <w:t xml:space="preserve">finance</w:t>
+            </w:r>
+            <w:r>
+              <w:rPr>
+                <w:sz w:val="18"/>
+                <w:szCs w:val="18"/>
+              </w:rPr>
+              <w:t xml:space="preserve">, </w:t>
+            </w:r>
+            <w:r>
+              <w:rPr>
+                <w:rFonts w:ascii="Consolas" w:cs="Consolas" w:eastAsia="Consolas" w:hAnsi="Consolas"/>
+                <w:color w:val="B91C1C"/>
+                <w:sz w:val="18"/>
+                <w:szCs w:val="18"/>
+                <w:shd w:fill="F1F5F9" w:val="clear"/>
+              </w:rPr>
+              <w:t xml:space="preserve">admin</w:t>
             </w:r>
           </w:p>
         </w:tc>
@@ -6974,6 +7204,317 @@
           <w:shd w:fill="F1F5F9" w:val="clear"/>
         </w:rPr>
         <w:t xml:space="preserve">sort_order</w:t>
+      </w:r>
+    </w:p>
+    <w:p>
+      <w:pPr>
+        <w:pStyle w:val="Heading2"/>
+        <w:spacing w:after="120" w:before="260"/>
+      </w:pPr>
+      <w:r>
+        <w:rPr>
+          <w:b/>
+          <w:bCs/>
+          <w:color w:val="002266"/>
+          <w:sz w:val="24"/>
+          <w:szCs w:val="24"/>
+        </w:rPr>
+        <w:t xml:space="preserve">barbados_clubs</w:t>
+      </w:r>
+    </w:p>
+    <w:p>
+      <w:pPr>
+        <w:spacing w:after="140" w:line="276"/>
+        <w:jc w:val="left"/>
+      </w:pPr>
+      <w:r>
+        <w:rPr>
+          <w:rFonts w:ascii="Consolas" w:cs="Consolas" w:eastAsia="Consolas" w:hAnsi="Consolas"/>
+          <w:color w:val="B91C1C"/>
+          <w:sz w:val="20"/>
+          <w:szCs w:val="20"/>
+          <w:shd w:fill="F1F5F9" w:val="clear"/>
+        </w:rPr>
+        <w:t xml:space="preserve">id</w:t>
+      </w:r>
+      <w:r>
+        <w:rPr>
+          <w:sz w:val="20"/>
+          <w:szCs w:val="20"/>
+        </w:rPr>
+        <w:t xml:space="preserve"> · </w:t>
+      </w:r>
+      <w:r>
+        <w:rPr>
+          <w:rFonts w:ascii="Consolas" w:cs="Consolas" w:eastAsia="Consolas" w:hAnsi="Consolas"/>
+          <w:color w:val="B91C1C"/>
+          <w:sz w:val="20"/>
+          <w:szCs w:val="20"/>
+          <w:shd w:fill="F1F5F9" w:val="clear"/>
+        </w:rPr>
+        <w:t xml:space="preserve">name</w:t>
+      </w:r>
+      <w:r>
+        <w:rPr>
+          <w:sz w:val="20"/>
+          <w:szCs w:val="20"/>
+        </w:rPr>
+        <w:t xml:space="preserve"> · </w:t>
+      </w:r>
+      <w:r>
+        <w:rPr>
+          <w:rFonts w:ascii="Consolas" w:cs="Consolas" w:eastAsia="Consolas" w:hAnsi="Consolas"/>
+          <w:color w:val="B91C1C"/>
+          <w:sz w:val="20"/>
+          <w:szCs w:val="20"/>
+          <w:shd w:fill="F1F5F9" w:val="clear"/>
+        </w:rPr>
+        <w:t xml:space="preserve">motto</w:t>
+      </w:r>
+      <w:r>
+        <w:rPr>
+          <w:sz w:val="20"/>
+          <w:szCs w:val="20"/>
+        </w:rPr>
+        <w:t xml:space="preserve"> · </w:t>
+      </w:r>
+      <w:r>
+        <w:rPr>
+          <w:rFonts w:ascii="Consolas" w:cs="Consolas" w:eastAsia="Consolas" w:hAnsi="Consolas"/>
+          <w:color w:val="B91C1C"/>
+          <w:sz w:val="20"/>
+          <w:szCs w:val="20"/>
+          <w:shd w:fill="F1F5F9" w:val="clear"/>
+        </w:rPr>
+        <w:t xml:space="preserve">charter_year</w:t>
+      </w:r>
+      <w:r>
+        <w:rPr>
+          <w:sz w:val="20"/>
+          <w:szCs w:val="20"/>
+        </w:rPr>
+        <w:t xml:space="preserve"> · </w:t>
+      </w:r>
+      <w:r>
+        <w:rPr>
+          <w:rFonts w:ascii="Consolas" w:cs="Consolas" w:eastAsia="Consolas" w:hAnsi="Consolas"/>
+          <w:color w:val="B91C1C"/>
+          <w:sz w:val="20"/>
+          <w:szCs w:val="20"/>
+          <w:shd w:fill="F1F5F9" w:val="clear"/>
+        </w:rPr>
+        <w:t xml:space="preserve">is_host</w:t>
+      </w:r>
+      <w:r>
+        <w:rPr>
+          <w:sz w:val="20"/>
+          <w:szCs w:val="20"/>
+        </w:rPr>
+        <w:t xml:space="preserve"> · </w:t>
+      </w:r>
+      <w:r>
+        <w:rPr>
+          <w:rFonts w:ascii="Consolas" w:cs="Consolas" w:eastAsia="Consolas" w:hAnsi="Consolas"/>
+          <w:color w:val="B91C1C"/>
+          <w:sz w:val="20"/>
+          <w:szCs w:val="20"/>
+          <w:shd w:fill="F1F5F9" w:val="clear"/>
+        </w:rPr>
+        <w:t xml:space="preserve">location</w:t>
+      </w:r>
+      <w:r>
+        <w:rPr>
+          <w:sz w:val="20"/>
+          <w:szCs w:val="20"/>
+        </w:rPr>
+        <w:t xml:space="preserve"> · </w:t>
+      </w:r>
+      <w:r>
+        <w:rPr>
+          <w:rFonts w:ascii="Consolas" w:cs="Consolas" w:eastAsia="Consolas" w:hAnsi="Consolas"/>
+          <w:color w:val="B91C1C"/>
+          <w:sz w:val="20"/>
+          <w:szCs w:val="20"/>
+          <w:shd w:fill="F1F5F9" w:val="clear"/>
+        </w:rPr>
+        <w:t xml:space="preserve">meeting_schedule</w:t>
+      </w:r>
+      <w:r>
+        <w:rPr>
+          <w:sz w:val="20"/>
+          <w:szCs w:val="20"/>
+        </w:rPr>
+        <w:t xml:space="preserve"> · </w:t>
+      </w:r>
+      <w:r>
+        <w:rPr>
+          <w:rFonts w:ascii="Consolas" w:cs="Consolas" w:eastAsia="Consolas" w:hAnsi="Consolas"/>
+          <w:color w:val="B91C1C"/>
+          <w:sz w:val="20"/>
+          <w:szCs w:val="20"/>
+          <w:shd w:fill="F1F5F9" w:val="clear"/>
+        </w:rPr>
+        <w:t xml:space="preserve">email</w:t>
+      </w:r>
+      <w:r>
+        <w:rPr>
+          <w:sz w:val="20"/>
+          <w:szCs w:val="20"/>
+        </w:rPr>
+        <w:t xml:space="preserve"> · </w:t>
+      </w:r>
+      <w:r>
+        <w:rPr>
+          <w:rFonts w:ascii="Consolas" w:cs="Consolas" w:eastAsia="Consolas" w:hAnsi="Consolas"/>
+          <w:color w:val="B91C1C"/>
+          <w:sz w:val="20"/>
+          <w:szCs w:val="20"/>
+          <w:shd w:fill="F1F5F9" w:val="clear"/>
+        </w:rPr>
+        <w:t xml:space="preserve">phone</w:t>
+      </w:r>
+      <w:r>
+        <w:rPr>
+          <w:sz w:val="20"/>
+          <w:szCs w:val="20"/>
+        </w:rPr>
+        <w:t xml:space="preserve"> · </w:t>
+      </w:r>
+      <w:r>
+        <w:rPr>
+          <w:rFonts w:ascii="Consolas" w:cs="Consolas" w:eastAsia="Consolas" w:hAnsi="Consolas"/>
+          <w:color w:val="B91C1C"/>
+          <w:sz w:val="20"/>
+          <w:szCs w:val="20"/>
+          <w:shd w:fill="F1F5F9" w:val="clear"/>
+        </w:rPr>
+        <w:t xml:space="preserve">website</w:t>
+      </w:r>
+      <w:r>
+        <w:rPr>
+          <w:sz w:val="20"/>
+          <w:szCs w:val="20"/>
+        </w:rPr>
+        <w:t xml:space="preserve"> · </w:t>
+      </w:r>
+      <w:r>
+        <w:rPr>
+          <w:rFonts w:ascii="Consolas" w:cs="Consolas" w:eastAsia="Consolas" w:hAnsi="Consolas"/>
+          <w:color w:val="B91C1C"/>
+          <w:sz w:val="20"/>
+          <w:szCs w:val="20"/>
+          <w:shd w:fill="F1F5F9" w:val="clear"/>
+        </w:rPr>
+        <w:t xml:space="preserve">description</w:t>
+      </w:r>
+      <w:r>
+        <w:rPr>
+          <w:sz w:val="20"/>
+          <w:szCs w:val="20"/>
+        </w:rPr>
+        <w:t xml:space="preserve"> · </w:t>
+      </w:r>
+      <w:r>
+        <w:rPr>
+          <w:rFonts w:ascii="Consolas" w:cs="Consolas" w:eastAsia="Consolas" w:hAnsi="Consolas"/>
+          <w:color w:val="B91C1C"/>
+          <w:sz w:val="20"/>
+          <w:szCs w:val="20"/>
+          <w:shd w:fill="F1F5F9" w:val="clear"/>
+        </w:rPr>
+        <w:t xml:space="preserve">initiatives</w:t>
+      </w:r>
+      <w:r>
+        <w:rPr>
+          <w:sz w:val="20"/>
+          <w:szCs w:val="20"/>
+        </w:rPr>
+        <w:t xml:space="preserve"> (</w:t>
+      </w:r>
+      <w:r>
+        <w:rPr>
+          <w:rFonts w:ascii="Consolas" w:cs="Consolas" w:eastAsia="Consolas" w:hAnsi="Consolas"/>
+          <w:color w:val="B91C1C"/>
+          <w:sz w:val="20"/>
+          <w:szCs w:val="20"/>
+          <w:shd w:fill="F1F5F9" w:val="clear"/>
+        </w:rPr>
+        <w:t xml:space="preserve">TEXT[]</w:t>
+      </w:r>
+      <w:r>
+        <w:rPr>
+          <w:sz w:val="20"/>
+          <w:szCs w:val="20"/>
+        </w:rPr>
+        <w:t xml:space="preserve">) · </w:t>
+      </w:r>
+      <w:r>
+        <w:rPr>
+          <w:rFonts w:ascii="Consolas" w:cs="Consolas" w:eastAsia="Consolas" w:hAnsi="Consolas"/>
+          <w:color w:val="B91C1C"/>
+          <w:sz w:val="20"/>
+          <w:szCs w:val="20"/>
+          <w:shd w:fill="F1F5F9" w:val="clear"/>
+        </w:rPr>
+        <w:t xml:space="preserve">sort_order</w:t>
+      </w:r>
+      <w:r>
+        <w:rPr>
+          <w:sz w:val="20"/>
+          <w:szCs w:val="20"/>
+        </w:rPr>
+        <w:t xml:space="preserve"> · </w:t>
+      </w:r>
+      <w:r>
+        <w:rPr>
+          <w:rFonts w:ascii="Consolas" w:cs="Consolas" w:eastAsia="Consolas" w:hAnsi="Consolas"/>
+          <w:color w:val="B91C1C"/>
+          <w:sz w:val="20"/>
+          <w:szCs w:val="20"/>
+          <w:shd w:fill="F1F5F9" w:val="clear"/>
+        </w:rPr>
+        <w:t xml:space="preserve">created_at</w:t>
+      </w:r>
+      <w:r>
+        <w:rPr>
+          <w:sz w:val="20"/>
+          <w:szCs w:val="20"/>
+        </w:rPr>
+        <w:t xml:space="preserve"> · </w:t>
+      </w:r>
+      <w:r>
+        <w:rPr>
+          <w:rFonts w:ascii="Consolas" w:cs="Consolas" w:eastAsia="Consolas" w:hAnsi="Consolas"/>
+          <w:color w:val="B91C1C"/>
+          <w:sz w:val="20"/>
+          <w:szCs w:val="20"/>
+          <w:shd w:fill="F1F5F9" w:val="clear"/>
+        </w:rPr>
+        <w:t xml:space="preserve">updated_at</w:t>
+      </w:r>
+      <w:r>
+        <w:rPr>
+          <w:sz w:val="20"/>
+          <w:szCs w:val="20"/>
+        </w:rPr>
+        <w:t xml:space="preserve">. Admin-editable via the console; the public </w:t>
+      </w:r>
+      <w:r>
+        <w:rPr>
+          <w:rFonts w:ascii="Consolas" w:cs="Consolas" w:eastAsia="Consolas" w:hAnsi="Consolas"/>
+          <w:color w:val="B91C1C"/>
+          <w:sz w:val="20"/>
+          <w:szCs w:val="20"/>
+          <w:shd w:fill="F1F5F9" w:val="clear"/>
+        </w:rPr>
+        <w:t xml:space="preserve">/barbados-clubs</w:t>
+      </w:r>
+      <w:r>
+        <w:rPr>
+          <w:sz w:val="20"/>
+          <w:szCs w:val="20"/>
+        </w:rPr>
+        <w:t xml:space="preserve"> page reads this table directly rather than a hardcoded array.</w:t>
       </w:r>
     </w:p>
     <w:p>
@@ -7991,7 +8532,7 @@
           <w:sz w:val="20"/>
           <w:szCs w:val="20"/>
         </w:rPr>
-        <w:t xml:space="preserve"> uploads a base64 image to Google Photos and records metadata. </w:t>
+        <w:t xml:space="preserve"> and </w:t>
       </w:r>
       <w:r>
         <w:rPr>
@@ -8008,7 +8549,58 @@
           <w:sz w:val="20"/>
           <w:szCs w:val="20"/>
         </w:rPr>
-        <w:t xml:space="preserve"> removes the local record subject to the uploader/admin check.</w:t>
+        <w:t xml:space="preserve"> both require a session (</w:t>
+      </w:r>
+      <w:r>
+        <w:rPr>
+          <w:rFonts w:ascii="Consolas" w:cs="Consolas" w:eastAsia="Consolas" w:hAnsi="Consolas"/>
+          <w:color w:val="B91C1C"/>
+          <w:sz w:val="20"/>
+          <w:szCs w:val="20"/>
+          <w:shd w:fill="F1F5F9" w:val="clear"/>
+        </w:rPr>
+        <w:t xml:space="preserve">getSession</w:t>
+      </w:r>
+      <w:r>
+        <w:rPr>
+          <w:sz w:val="20"/>
+          <w:szCs w:val="20"/>
+        </w:rPr>
+        <w:t xml:space="preserve">) — identity and permission are derived from the verified token, never from client-supplied fields. </w:t>
+      </w:r>
+      <w:r>
+        <w:rPr>
+          <w:rFonts w:ascii="Consolas" w:cs="Consolas" w:eastAsia="Consolas" w:hAnsi="Consolas"/>
+          <w:color w:val="B91C1C"/>
+          <w:sz w:val="20"/>
+          <w:szCs w:val="20"/>
+          <w:shd w:fill="F1F5F9" w:val="clear"/>
+        </w:rPr>
+        <w:t xml:space="preserve">POST</w:t>
+      </w:r>
+      <w:r>
+        <w:rPr>
+          <w:sz w:val="20"/>
+          <w:szCs w:val="20"/>
+        </w:rPr>
+        <w:t xml:space="preserve"> uploads a base64 image to Google Photos, attributing it to the session's own member id/name. </w:t>
+      </w:r>
+      <w:r>
+        <w:rPr>
+          <w:rFonts w:ascii="Consolas" w:cs="Consolas" w:eastAsia="Consolas" w:hAnsi="Consolas"/>
+          <w:color w:val="B91C1C"/>
+          <w:sz w:val="20"/>
+          <w:szCs w:val="20"/>
+          <w:shd w:fill="F1F5F9" w:val="clear"/>
+        </w:rPr>
+        <w:t xml:space="preserve">DELETE</w:t>
+      </w:r>
+      <w:r>
+        <w:rPr>
+          <w:sz w:val="20"/>
+          <w:szCs w:val="20"/>
+        </w:rPr>
+        <w:t xml:space="preserve"> removes the local record if the caller is an admin/finance tier or the original uploader.</w:t>
       </w:r>
     </w:p>
     <w:p>
@@ -8172,6 +8764,181 @@
           <w:szCs w:val="20"/>
         </w:rPr>
         <w:t xml:space="preserve">.</w:t>
+      </w:r>
+    </w:p>
+    <w:p>
+      <w:pPr>
+        <w:pStyle w:val="Heading2"/>
+        <w:spacing w:after="120" w:before="260"/>
+      </w:pPr>
+      <w:r>
+        <w:rPr>
+          <w:b/>
+          <w:bCs/>
+          <w:color w:val="002266"/>
+          <w:sz w:val="24"/>
+          <w:szCs w:val="24"/>
+        </w:rPr>
+        <w:t xml:space="preserve">GET|POST /api/barbados-clubs</w:t>
+      </w:r>
+    </w:p>
+    <w:p>
+      <w:pPr>
+        <w:spacing w:after="140" w:line="276"/>
+        <w:jc w:val="left"/>
+      </w:pPr>
+      <w:r>
+        <w:rPr>
+          <w:rFonts w:ascii="Consolas" w:cs="Consolas" w:eastAsia="Consolas" w:hAnsi="Consolas"/>
+          <w:color w:val="B91C1C"/>
+          <w:sz w:val="20"/>
+          <w:szCs w:val="20"/>
+          <w:shd w:fill="F1F5F9" w:val="clear"/>
+        </w:rPr>
+        <w:t xml:space="preserve">GET</w:t>
+      </w:r>
+      <w:r>
+        <w:rPr>
+          <w:sz w:val="20"/>
+          <w:szCs w:val="20"/>
+        </w:rPr>
+        <w:t xml:space="preserve"> is public — the </w:t>
+      </w:r>
+      <w:r>
+        <w:rPr>
+          <w:rFonts w:ascii="Consolas" w:cs="Consolas" w:eastAsia="Consolas" w:hAnsi="Consolas"/>
+          <w:color w:val="B91C1C"/>
+          <w:sz w:val="20"/>
+          <w:szCs w:val="20"/>
+          <w:shd w:fill="F1F5F9" w:val="clear"/>
+        </w:rPr>
+        <w:t xml:space="preserve">/barbados-clubs</w:t>
+      </w:r>
+      <w:r>
+        <w:rPr>
+          <w:sz w:val="20"/>
+          <w:szCs w:val="20"/>
+        </w:rPr>
+        <w:t xml:space="preserve"> directory page needs it without a session. </w:t>
+      </w:r>
+      <w:r>
+        <w:rPr>
+          <w:rFonts w:ascii="Consolas" w:cs="Consolas" w:eastAsia="Consolas" w:hAnsi="Consolas"/>
+          <w:color w:val="B91C1C"/>
+          <w:sz w:val="20"/>
+          <w:szCs w:val="20"/>
+          <w:shd w:fill="F1F5F9" w:val="clear"/>
+        </w:rPr>
+        <w:t xml:space="preserve">POST</w:t>
+      </w:r>
+      <w:r>
+        <w:rPr>
+          <w:sz w:val="20"/>
+          <w:szCs w:val="20"/>
+        </w:rPr>
+        <w:t xml:space="preserve"> actions </w:t>
+      </w:r>
+      <w:r>
+        <w:rPr>
+          <w:rFonts w:ascii="Consolas" w:cs="Consolas" w:eastAsia="Consolas" w:hAnsi="Consolas"/>
+          <w:color w:val="B91C1C"/>
+          <w:sz w:val="20"/>
+          <w:szCs w:val="20"/>
+          <w:shd w:fill="F1F5F9" w:val="clear"/>
+        </w:rPr>
+        <w:t xml:space="preserve">add</w:t>
+      </w:r>
+      <w:r>
+        <w:rPr>
+          <w:sz w:val="20"/>
+          <w:szCs w:val="20"/>
+        </w:rPr>
+        <w:t xml:space="preserve">, </w:t>
+      </w:r>
+      <w:r>
+        <w:rPr>
+          <w:rFonts w:ascii="Consolas" w:cs="Consolas" w:eastAsia="Consolas" w:hAnsi="Consolas"/>
+          <w:color w:val="B91C1C"/>
+          <w:sz w:val="20"/>
+          <w:szCs w:val="20"/>
+          <w:shd w:fill="F1F5F9" w:val="clear"/>
+        </w:rPr>
+        <w:t xml:space="preserve">update</w:t>
+      </w:r>
+      <w:r>
+        <w:rPr>
+          <w:sz w:val="20"/>
+          <w:szCs w:val="20"/>
+        </w:rPr>
+        <w:t xml:space="preserve">, </w:t>
+      </w:r>
+      <w:r>
+        <w:rPr>
+          <w:rFonts w:ascii="Consolas" w:cs="Consolas" w:eastAsia="Consolas" w:hAnsi="Consolas"/>
+          <w:color w:val="B91C1C"/>
+          <w:sz w:val="20"/>
+          <w:szCs w:val="20"/>
+          <w:shd w:fill="F1F5F9" w:val="clear"/>
+        </w:rPr>
+        <w:t xml:space="preserve">delete</w:t>
+      </w:r>
+      <w:r>
+        <w:rPr>
+          <w:sz w:val="20"/>
+          <w:szCs w:val="20"/>
+        </w:rPr>
+        <w:t xml:space="preserve"> are gated to </w:t>
+      </w:r>
+      <w:r>
+        <w:rPr>
+          <w:rFonts w:ascii="Consolas" w:cs="Consolas" w:eastAsia="Consolas" w:hAnsi="Consolas"/>
+          <w:color w:val="B91C1C"/>
+          <w:sz w:val="20"/>
+          <w:szCs w:val="20"/>
+          <w:shd w:fill="F1F5F9" w:val="clear"/>
+        </w:rPr>
+        <w:t xml:space="preserve">super admin</w:t>
+      </w:r>
+      <w:r>
+        <w:rPr>
+          <w:sz w:val="20"/>
+          <w:szCs w:val="20"/>
+        </w:rPr>
+        <w:t xml:space="preserve">/</w:t>
+      </w:r>
+      <w:r>
+        <w:rPr>
+          <w:rFonts w:ascii="Consolas" w:cs="Consolas" w:eastAsia="Consolas" w:hAnsi="Consolas"/>
+          <w:color w:val="B91C1C"/>
+          <w:sz w:val="20"/>
+          <w:szCs w:val="20"/>
+          <w:shd w:fill="F1F5F9" w:val="clear"/>
+        </w:rPr>
+        <w:t xml:space="preserve">finance</w:t>
+      </w:r>
+      <w:r>
+        <w:rPr>
+          <w:sz w:val="20"/>
+          <w:szCs w:val="20"/>
+        </w:rPr>
+        <w:t xml:space="preserve">/</w:t>
+      </w:r>
+      <w:r>
+        <w:rPr>
+          <w:rFonts w:ascii="Consolas" w:cs="Consolas" w:eastAsia="Consolas" w:hAnsi="Consolas"/>
+          <w:color w:val="B91C1C"/>
+          <w:sz w:val="20"/>
+          <w:szCs w:val="20"/>
+          <w:shd w:fill="F1F5F9" w:val="clear"/>
+        </w:rPr>
+        <w:t xml:space="preserve">admin</w:t>
+      </w:r>
+      <w:r>
+        <w:rPr>
+          <w:sz w:val="20"/>
+          <w:szCs w:val="20"/>
+        </w:rPr>
+        <w:t xml:space="preserve">, same tier as site settings.</w:t>
       </w:r>
     </w:p>
     <w:p>
@@ -8854,6 +9621,69 @@
           <w:szCs w:val="20"/>
         </w:rPr>
         <w:t xml:space="preserve">) rather than being hidden.</w:t>
+      </w:r>
+    </w:p>
+    <w:p>
+      <w:pPr>
+        <w:pStyle w:val="Heading2"/>
+        <w:spacing w:after="120" w:before="260"/>
+      </w:pPr>
+      <w:r>
+        <w:rPr>
+          <w:b/>
+          <w:bCs/>
+          <w:color w:val="002266"/>
+          <w:sz w:val="24"/>
+          <w:szCs w:val="24"/>
+        </w:rPr>
+        <w:t xml:space="preserve">Notifications</w:t>
+      </w:r>
+    </w:p>
+    <w:p>
+      <w:pPr>
+        <w:spacing w:after="140" w:line="276"/>
+        <w:jc w:val="left"/>
+      </w:pPr>
+      <w:r>
+        <w:rPr>
+          <w:sz w:val="20"/>
+          <w:szCs w:val="20"/>
+        </w:rPr>
+        <w:t xml:space="preserve">After each successful webhook write, the club's configured contact address (</w:t>
+      </w:r>
+      <w:r>
+        <w:rPr>
+          <w:rFonts w:ascii="Consolas" w:cs="Consolas" w:eastAsia="Consolas" w:hAnsi="Consolas"/>
+          <w:color w:val="B91C1C"/>
+          <w:sz w:val="20"/>
+          <w:szCs w:val="20"/>
+          <w:shd w:fill="F1F5F9" w:val="clear"/>
+        </w:rPr>
+        <w:t xml:space="preserve">getContactEmail()</w:t>
+      </w:r>
+      <w:r>
+        <w:rPr>
+          <w:sz w:val="20"/>
+          <w:szCs w:val="20"/>
+        </w:rPr>
+        <w:t xml:space="preserve"> — same address the Contact form uses) is emailed a summary via </w:t>
+      </w:r>
+      <w:r>
+        <w:rPr>
+          <w:rFonts w:ascii="Consolas" w:cs="Consolas" w:eastAsia="Consolas" w:hAnsi="Consolas"/>
+          <w:color w:val="B91C1C"/>
+          <w:sz w:val="20"/>
+          <w:szCs w:val="20"/>
+          <w:shd w:fill="F1F5F9" w:val="clear"/>
+        </w:rPr>
+        <w:t xml:space="preserve">lib/email.js</w:t>
+      </w:r>
+      <w:r>
+        <w:rPr>
+          <w:sz w:val="20"/>
+          <w:szCs w:val="20"/>
+        </w:rPr>
+        <w:t xml:space="preserve">: member/amount/ balance for dues payments, donor/amount for donations. This reuses the existing SES helper, so it inherits the non-production redirect safeguard and never throws on failure — a notification problem can't block payment recording or the webhook's response back to Stripe.</w:t>
       </w:r>
     </w:p>
     <w:p>
@@ -10120,7 +10950,41 @@
           <w:sz w:val="20"/>
           <w:szCs w:val="20"/>
         </w:rPr>
-        <w:t xml:space="preserve"> and are edited from the admin console's *Variables* tab: meeting schedule and venue, contact email, annual dues rate, club theme title, homepage announcement banner, and the bank transfer details shown on the Donate page. Changing the dues rate propagates to new member records, the Membership page, and Stripe dues checkout from one place.</w:t>
+        <w:t xml:space="preserve"> and are edited from the admin console's *Variables* tab: meeting schedule and venue, contact email, annual dues rate, club theme title, homepage announcement banner, and the bank transfer details shown on the Donate page. Changing the dues rate propagates to new member records, the Membership page, and Stripe dues checkout from one place. The bank-detail fields default to </w:t>
+      </w:r>
+      <w:r>
+        <w:rPr>
+          <w:rFonts w:ascii="Consolas" w:cs="Consolas" w:eastAsia="Consolas" w:hAnsi="Consolas"/>
+          <w:color w:val="B91C1C"/>
+          <w:sz w:val="20"/>
+          <w:szCs w:val="20"/>
+          <w:shd w:fill="F1F5F9" w:val="clear"/>
+        </w:rPr>
+        <w:t xml:space="preserve">"Not yet configured"</w:t>
+      </w:r>
+      <w:r>
+        <w:rPr>
+          <w:sz w:val="20"/>
+          <w:szCs w:val="20"/>
+        </w:rPr>
+        <w:t xml:space="preserve"> in source — the real values are seeded into the database once (</w:t>
+      </w:r>
+      <w:r>
+        <w:rPr>
+          <w:rFonts w:ascii="Consolas" w:cs="Consolas" w:eastAsia="Consolas" w:hAnsi="Consolas"/>
+          <w:color w:val="B91C1C"/>
+          <w:sz w:val="20"/>
+          <w:szCs w:val="20"/>
+          <w:shd w:fill="F1F5F9" w:val="clear"/>
+        </w:rPr>
+        <w:t xml:space="preserve">scripts/migrate_add_bank_details.js</w:t>
+      </w:r>
+      <w:r>
+        <w:rPr>
+          <w:sz w:val="20"/>
+          <w:szCs w:val="20"/>
+        </w:rPr>
+        <w:t xml:space="preserve">) and from then on live only there, never as a source-level fallback.</w:t>
       </w:r>
     </w:p>
     <w:p>
@@ -10566,7 +11430,24 @@
           <w:sz w:val="20"/>
           <w:szCs w:val="20"/>
         </w:rPr>
-        <w:t xml:space="preserve">, plus data fixers such as </w:t>
+        <w:t xml:space="preserve">, </w:t>
+      </w:r>
+      <w:r>
+        <w:rPr>
+          <w:rFonts w:ascii="Consolas" w:cs="Consolas" w:eastAsia="Consolas" w:hAnsi="Consolas"/>
+          <w:color w:val="B91C1C"/>
+          <w:sz w:val="20"/>
+          <w:szCs w:val="20"/>
+          <w:shd w:fill="F1F5F9" w:val="clear"/>
+        </w:rPr>
+        <w:t xml:space="preserve">migrate_add_barbados_clubs_table.js</w:t>
+      </w:r>
+      <w:r>
+        <w:rPr>
+          <w:sz w:val="20"/>
+          <w:szCs w:val="20"/>
+        </w:rPr>
+        <w:t xml:space="preserve"> (also seeds the four existing clubs on first run), plus data fixers such as </w:t>
       </w:r>
       <w:r>
         <w:rPr>
@@ -10643,20 +11524,13 @@
       </w:pPr>
       <w:r>
         <w:rPr>
-          <w:sz w:val="20"/>
-          <w:szCs w:val="20"/>
-        </w:rPr>
-        <w:t xml:space="preserve">Point the Stripe CLI at </w:t>
-      </w:r>
-      <w:r>
-        <w:rPr>
-          <w:rFonts w:ascii="Consolas" w:cs="Consolas" w:eastAsia="Consolas" w:hAnsi="Consolas"/>
-          <w:color w:val="B91C1C"/>
-          <w:sz w:val="20"/>
-          <w:szCs w:val="20"/>
-          <w:shd w:fill="F1F5F9" w:val="clear"/>
-        </w:rPr>
-        <w:t xml:space="preserve">/api/stripe-webhook</w:t>
+          <w:rFonts w:ascii="Consolas" w:cs="Consolas" w:eastAsia="Consolas" w:hAnsi="Consolas"/>
+          <w:color w:val="B91C1C"/>
+          <w:sz w:val="20"/>
+          <w:szCs w:val="20"/>
+          <w:shd w:fill="F1F5F9" w:val="clear"/>
+        </w:rPr>
+        <w:t xml:space="preserve">stripe listen --forward-to localhost:3000/api/stripe-webhook</w:t>
       </w:r>
       <w:r>
         <w:rPr>
@@ -10680,7 +11554,58 @@
           <w:sz w:val="20"/>
           <w:szCs w:val="20"/>
         </w:rPr>
-        <w:t xml:space="preserve"> to the secret the CLI prints; the route rejects any request whose signature does not verify.</w:t>
+        <w:t xml:space="preserve"> to the secret the CLI prints; the route rejects any request whose signature does not verify. This now works correctly through </w:t>
+      </w:r>
+      <w:r>
+        <w:rPr>
+          <w:rFonts w:ascii="Consolas" w:cs="Consolas" w:eastAsia="Consolas" w:hAnsi="Consolas"/>
+          <w:color w:val="B91C1C"/>
+          <w:sz w:val="20"/>
+          <w:szCs w:val="20"/>
+          <w:shd w:fill="F1F5F9" w:val="clear"/>
+        </w:rPr>
+        <w:t xml:space="preserve">npm run dev</w:t>
+      </w:r>
+      <w:r>
+        <w:rPr>
+          <w:sz w:val="20"/>
+          <w:szCs w:val="20"/>
+        </w:rPr>
+        <w:t xml:space="preserve"> — the dev middleware skips body pre-parsing for routes (like this one) that export </w:t>
+      </w:r>
+      <w:r>
+        <w:rPr>
+          <w:rFonts w:ascii="Consolas" w:cs="Consolas" w:eastAsia="Consolas" w:hAnsi="Consolas"/>
+          <w:color w:val="B91C1C"/>
+          <w:sz w:val="20"/>
+          <w:szCs w:val="20"/>
+          <w:shd w:fill="F1F5F9" w:val="clear"/>
+        </w:rPr>
+        <w:t xml:space="preserve">config.api.bodyParser = false</w:t>
+      </w:r>
+      <w:r>
+        <w:rPr>
+          <w:sz w:val="20"/>
+          <w:szCs w:val="20"/>
+        </w:rPr>
+        <w:t xml:space="preserve">, matching Vercel's behavior. A request with a bad or missing signature returns a fast </w:t>
+      </w:r>
+      <w:r>
+        <w:rPr>
+          <w:rFonts w:ascii="Consolas" w:cs="Consolas" w:eastAsia="Consolas" w:hAnsi="Consolas"/>
+          <w:color w:val="B91C1C"/>
+          <w:sz w:val="20"/>
+          <w:szCs w:val="20"/>
+          <w:shd w:fill="F1F5F9" w:val="clear"/>
+        </w:rPr>
+        <w:t xml:space="preserve">400</w:t>
+      </w:r>
+      <w:r>
+        <w:rPr>
+          <w:sz w:val="20"/>
+          <w:szCs w:val="20"/>
+        </w:rPr>
+        <w:t xml:space="preserve">; previously (before that middleware fix) it hung indefinitely instead.</w:t>
       </w:r>
     </w:p>
     <w:p>
@@ -10808,7 +11733,24 @@
           <w:sz w:val="20"/>
           <w:szCs w:val="20"/>
         </w:rPr>
-        <w:t xml:space="preserve"> becomes one serverless function — the Hobby plan's 12-function limit is a real constraint, and is the reason gallery operations were consolidated into a single handler. Configure all environment variables in the Vercel project settings.</w:t>
+        <w:t xml:space="preserve"> becomes one serverless function — the Hobby plan's 12-function limit is a real constraint, and is the reason gallery operations were consolidated into a single handler. As of </w:t>
+      </w:r>
+      <w:r>
+        <w:rPr>
+          <w:rFonts w:ascii="Consolas" w:cs="Consolas" w:eastAsia="Consolas" w:hAnsi="Consolas"/>
+          <w:color w:val="B91C1C"/>
+          <w:sz w:val="20"/>
+          <w:szCs w:val="20"/>
+          <w:shd w:fill="F1F5F9" w:val="clear"/>
+        </w:rPr>
+        <w:t xml:space="preserve">api/barbados-clubs.js</w:t>
+      </w:r>
+      <w:r>
+        <w:rPr>
+          <w:sz w:val="20"/>
+          <w:szCs w:val="20"/>
+        </w:rPr>
+        <w:t xml:space="preserve">, the project is now at exactly 12 of 12 functions — any further route needs to be folded into an existing handler (action-dispatch style) rather than added as a new file. Configure all environment variables in the Vercel project settings.</w:t>
       </w:r>
     </w:p>
     <w:p>
@@ -11399,21 +12341,6 @@
     </w:p>
     <w:p>
       <w:pPr>
-        <w:spacing w:after="140" w:line="276"/>
-        <w:jc w:val="left"/>
-      </w:pPr>
-      <w:r>
-        <w:rPr>
-          <w:b/>
-          <w:bCs/>
-          <w:sz w:val="20"/>
-          <w:szCs w:val="20"/>
-        </w:rPr>
-        <w:t xml:space="preserve">Worth reviewing</w:t>
-      </w:r>
-    </w:p>
-    <w:p>
-      <w:pPr>
         <w:pStyle w:val="ListParagraph"/>
         <w:numPr>
           <w:ilvl w:val="0"/>
@@ -11429,14 +12356,82 @@
           <w:szCs w:val="20"/>
           <w:shd w:fill="F1F5F9" w:val="clear"/>
         </w:rPr>
-        <w:t xml:space="preserve">api/site-settings.js</w:t>
-      </w:r>
-      <w:r>
-        <w:rPr>
-          <w:sz w:val="20"/>
-          <w:szCs w:val="20"/>
-        </w:rPr>
-        <w:t xml:space="preserve"> carries real-looking bank account and routing numbers as hardcoded fallback defaults in a public repository. They should be moved to environment variables or seeded data only.</w:t>
+        <w:t xml:space="preserve">api/gallery.js</w:t>
+      </w:r>
+      <w:r>
+        <w:rPr>
+          <w:sz w:val="20"/>
+          <w:szCs w:val="20"/>
+        </w:rPr>
+        <w:t xml:space="preserve"> upload/delete derive identity and permission from the verified session (</w:t>
+      </w:r>
+      <w:r>
+        <w:rPr>
+          <w:rFonts w:ascii="Consolas" w:cs="Consolas" w:eastAsia="Consolas" w:hAnsi="Consolas"/>
+          <w:color w:val="B91C1C"/>
+          <w:sz w:val="20"/>
+          <w:szCs w:val="20"/>
+          <w:shd w:fill="F1F5F9" w:val="clear"/>
+        </w:rPr>
+        <w:t xml:space="preserve">getSession</w:t>
+      </w:r>
+      <w:r>
+        <w:rPr>
+          <w:sz w:val="20"/>
+          <w:szCs w:val="20"/>
+        </w:rPr>
+        <w:t xml:space="preserve">), not from client-supplied fields — a request can no longer claim any role or member id it likes to attribute or delete a photo. (Previously it trusted </w:t>
+      </w:r>
+      <w:r>
+        <w:rPr>
+          <w:rFonts w:ascii="Consolas" w:cs="Consolas" w:eastAsia="Consolas" w:hAnsi="Consolas"/>
+          <w:color w:val="B91C1C"/>
+          <w:sz w:val="20"/>
+          <w:szCs w:val="20"/>
+          <w:shd w:fill="F1F5F9" w:val="clear"/>
+        </w:rPr>
+        <w:t xml:space="preserve">userRole</w:t>
+      </w:r>
+      <w:r>
+        <w:rPr>
+          <w:sz w:val="20"/>
+          <w:szCs w:val="20"/>
+        </w:rPr>
+        <w:t xml:space="preserve">/</w:t>
+      </w:r>
+      <w:r>
+        <w:rPr>
+          <w:rFonts w:ascii="Consolas" w:cs="Consolas" w:eastAsia="Consolas" w:hAnsi="Consolas"/>
+          <w:color w:val="B91C1C"/>
+          <w:sz w:val="20"/>
+          <w:szCs w:val="20"/>
+          <w:shd w:fill="F1F5F9" w:val="clear"/>
+        </w:rPr>
+        <w:t xml:space="preserve">userAccess</w:t>
+      </w:r>
+      <w:r>
+        <w:rPr>
+          <w:sz w:val="20"/>
+          <w:szCs w:val="20"/>
+        </w:rPr>
+        <w:t xml:space="preserve">/</w:t>
+      </w:r>
+      <w:r>
+        <w:rPr>
+          <w:rFonts w:ascii="Consolas" w:cs="Consolas" w:eastAsia="Consolas" w:hAnsi="Consolas"/>
+          <w:color w:val="B91C1C"/>
+          <w:sz w:val="20"/>
+          <w:szCs w:val="20"/>
+          <w:shd w:fill="F1F5F9" w:val="clear"/>
+        </w:rPr>
+        <w:t xml:space="preserve">userMemberId</w:t>
+      </w:r>
+      <w:r>
+        <w:rPr>
+          <w:sz w:val="20"/>
+          <w:szCs w:val="20"/>
+        </w:rPr>
+        <w:t xml:space="preserve"> sent in the request body.)</w:t>
       </w:r>
     </w:p>
     <w:p>
@@ -11450,20 +12445,78 @@
       </w:pPr>
       <w:r>
         <w:rPr>
-          <w:rFonts w:ascii="Consolas" w:cs="Consolas" w:eastAsia="Consolas" w:hAnsi="Consolas"/>
-          <w:color w:val="B91C1C"/>
-          <w:sz w:val="20"/>
-          <w:szCs w:val="20"/>
-          <w:shd w:fill="F1F5F9" w:val="clear"/>
-        </w:rPr>
-        <w:t xml:space="preserve">api/gallery.js</w:t>
-      </w:r>
-      <w:r>
-        <w:rPr>
-          <w:sz w:val="20"/>
-          <w:szCs w:val="20"/>
-        </w:rPr>
-        <w:t xml:space="preserve"> performs its own permission check from </w:t>
+          <w:sz w:val="20"/>
+          <w:szCs w:val="20"/>
+        </w:rPr>
+        <w:t xml:space="preserve">The club's real bank account/routing numbers are no longer hardcoded as source-level fallback defaults (</w:t>
+      </w:r>
+      <w:r>
+        <w:rPr>
+          <w:rFonts w:ascii="Consolas" w:cs="Consolas" w:eastAsia="Consolas" w:hAnsi="Consolas"/>
+          <w:color w:val="B91C1C"/>
+          <w:sz w:val="20"/>
+          <w:szCs w:val="20"/>
+          <w:shd w:fill="F1F5F9" w:val="clear"/>
+        </w:rPr>
+        <w:t xml:space="preserve">api/site-settings.js</w:t>
+      </w:r>
+      <w:r>
+        <w:rPr>
+          <w:sz w:val="20"/>
+          <w:szCs w:val="20"/>
+        </w:rPr>
+        <w:t xml:space="preserve">, </w:t>
+      </w:r>
+      <w:r>
+        <w:rPr>
+          <w:rFonts w:ascii="Consolas" w:cs="Consolas" w:eastAsia="Consolas" w:hAnsi="Consolas"/>
+          <w:color w:val="B91C1C"/>
+          <w:sz w:val="20"/>
+          <w:szCs w:val="20"/>
+          <w:shd w:fill="F1F5F9" w:val="clear"/>
+        </w:rPr>
+        <w:t xml:space="preserve">AuthContext.jsx</w:t>
+      </w:r>
+      <w:r>
+        <w:rPr>
+          <w:sz w:val="20"/>
+          <w:szCs w:val="20"/>
+        </w:rPr>
+        <w:t xml:space="preserve">, </w:t>
+      </w:r>
+      <w:r>
+        <w:rPr>
+          <w:rFonts w:ascii="Consolas" w:cs="Consolas" w:eastAsia="Consolas" w:hAnsi="Consolas"/>
+          <w:color w:val="B91C1C"/>
+          <w:sz w:val="20"/>
+          <w:szCs w:val="20"/>
+          <w:shd w:fill="F1F5F9" w:val="clear"/>
+        </w:rPr>
+        <w:t xml:space="preserve">AdminSettingsPage.jsx</w:t>
+      </w:r>
+      <w:r>
+        <w:rPr>
+          <w:sz w:val="20"/>
+          <w:szCs w:val="20"/>
+        </w:rPr>
+        <w:t xml:space="preserve"> all show </w:t>
+      </w:r>
+      <w:r>
+        <w:rPr>
+          <w:rFonts w:ascii="Consolas" w:cs="Consolas" w:eastAsia="Consolas" w:hAnsi="Consolas"/>
+          <w:color w:val="B91C1C"/>
+          <w:sz w:val="20"/>
+          <w:szCs w:val="20"/>
+          <w:shd w:fill="F1F5F9" w:val="clear"/>
+        </w:rPr>
+        <w:t xml:space="preserve">"Not yet configured"</w:t>
+      </w:r>
+      <w:r>
+        <w:rPr>
+          <w:sz w:val="20"/>
+          <w:szCs w:val="20"/>
+        </w:rPr>
+        <w:t xml:space="preserve"> until an admin sets real values via Site Variables). Note: the values still exist in this repository's </w:t>
       </w:r>
       <w:r>
         <w:rPr>
@@ -11472,99 +12525,46 @@
           <w:sz w:val="20"/>
           <w:szCs w:val="20"/>
         </w:rPr>
-        <w:t xml:space="preserve">client-supplied</w:t>
-      </w:r>
-      <w:r>
-        <w:rPr>
-          <w:sz w:val="20"/>
-          <w:szCs w:val="20"/>
-        </w:rPr>
-        <w:t xml:space="preserve"> </w:t>
-      </w:r>
-      <w:r>
-        <w:rPr>
-          <w:rFonts w:ascii="Consolas" w:cs="Consolas" w:eastAsia="Consolas" w:hAnsi="Consolas"/>
-          <w:color w:val="B91C1C"/>
-          <w:sz w:val="20"/>
-          <w:szCs w:val="20"/>
-          <w:shd w:fill="F1F5F9" w:val="clear"/>
-        </w:rPr>
-        <w:t xml:space="preserve">userRole</w:t>
-      </w:r>
-      <w:r>
-        <w:rPr>
-          <w:sz w:val="20"/>
-          <w:szCs w:val="20"/>
-        </w:rPr>
-        <w:t xml:space="preserve"> / </w:t>
-      </w:r>
-      <w:r>
-        <w:rPr>
-          <w:rFonts w:ascii="Consolas" w:cs="Consolas" w:eastAsia="Consolas" w:hAnsi="Consolas"/>
-          <w:color w:val="B91C1C"/>
-          <w:sz w:val="20"/>
-          <w:szCs w:val="20"/>
-          <w:shd w:fill="F1F5F9" w:val="clear"/>
-        </w:rPr>
-        <w:t xml:space="preserve">userAccess</w:t>
-      </w:r>
-      <w:r>
-        <w:rPr>
-          <w:sz w:val="20"/>
-          <w:szCs w:val="20"/>
-        </w:rPr>
-        <w:t xml:space="preserve"> / </w:t>
-      </w:r>
-      <w:r>
-        <w:rPr>
-          <w:rFonts w:ascii="Consolas" w:cs="Consolas" w:eastAsia="Consolas" w:hAnsi="Consolas"/>
-          <w:color w:val="B91C1C"/>
-          <w:sz w:val="20"/>
-          <w:szCs w:val="20"/>
-          <w:shd w:fill="F1F5F9" w:val="clear"/>
-        </w:rPr>
-        <w:t xml:space="preserve">userMemberId</w:t>
-      </w:r>
-      <w:r>
-        <w:rPr>
-          <w:sz w:val="20"/>
-          <w:szCs w:val="20"/>
-        </w:rPr>
-        <w:t xml:space="preserve"> fields rather than from the verified session, unlike every other route. It should use </w:t>
-      </w:r>
-      <w:r>
-        <w:rPr>
-          <w:rFonts w:ascii="Consolas" w:cs="Consolas" w:eastAsia="Consolas" w:hAnsi="Consolas"/>
-          <w:color w:val="B91C1C"/>
-          <w:sz w:val="20"/>
-          <w:szCs w:val="20"/>
-          <w:shd w:fill="F1F5F9" w:val="clear"/>
-        </w:rPr>
-        <w:t xml:space="preserve">getSession</w:t>
-      </w:r>
-      <w:r>
-        <w:rPr>
-          <w:sz w:val="20"/>
-          <w:szCs w:val="20"/>
-        </w:rPr>
-        <w:t xml:space="preserve">/</w:t>
-      </w:r>
-      <w:r>
-        <w:rPr>
-          <w:rFonts w:ascii="Consolas" w:cs="Consolas" w:eastAsia="Consolas" w:hAnsi="Consolas"/>
-          <w:color w:val="B91C1C"/>
-          <w:sz w:val="20"/>
-          <w:szCs w:val="20"/>
-          <w:shd w:fill="F1F5F9" w:val="clear"/>
-        </w:rPr>
-        <w:t xml:space="preserve">requireAccess</w:t>
-      </w:r>
-      <w:r>
-        <w:rPr>
-          <w:sz w:val="20"/>
-          <w:szCs w:val="20"/>
-        </w:rPr>
-        <w:t xml:space="preserve"> like the rest.</w:t>
+        <w:t xml:space="preserve">git history</w:t>
+      </w:r>
+      <w:r>
+        <w:rPr>
+          <w:sz w:val="20"/>
+          <w:szCs w:val="20"/>
+        </w:rPr>
+        <w:t xml:space="preserve"> and in </w:t>
+      </w:r>
+      <w:r>
+        <w:rPr>
+          <w:rFonts w:ascii="Consolas" w:cs="Consolas" w:eastAsia="Consolas" w:hAnsi="Consolas"/>
+          <w:color w:val="B91C1C"/>
+          <w:sz w:val="20"/>
+          <w:szCs w:val="20"/>
+          <w:shd w:fill="F1F5F9" w:val="clear"/>
+        </w:rPr>
+        <w:t xml:space="preserve">scripts/migrate_add_bank_details.js</w:t>
+      </w:r>
+      <w:r>
+        <w:rPr>
+          <w:sz w:val="20"/>
+          <w:szCs w:val="20"/>
+        </w:rPr>
+        <w:t xml:space="preserve"> (a one-off seeding script) — removing them from history entirely would require a rewrite and force-push, which hasn't been done.</w:t>
+      </w:r>
+    </w:p>
+    <w:p>
+      <w:pPr>
+        <w:spacing w:after="140" w:line="276"/>
+        <w:jc w:val="left"/>
+      </w:pPr>
+      <w:r>
+        <w:rPr>
+          <w:b/>
+          <w:bCs/>
+          <w:sz w:val="20"/>
+          <w:szCs w:val="20"/>
+        </w:rPr>
+        <w:t xml:space="preserve">Worth reviewing</w:t>
       </w:r>
     </w:p>
     <w:p>
@@ -11616,6 +12616,57 @@
           <w:szCs w:val="20"/>
         </w:rPr>
         <w:t xml:space="preserve"> plus a random four-digit number) are generated without a uniqueness check; collisions are unlikely but not impossible.</w:t>
+      </w:r>
+    </w:p>
+    <w:p>
+      <w:pPr>
+        <w:pStyle w:val="ListParagraph"/>
+        <w:numPr>
+          <w:ilvl w:val="0"/>
+          <w:numId w:val="3"/>
+        </w:numPr>
+        <w:spacing w:after="80"/>
+      </w:pPr>
+      <w:r>
+        <w:rPr>
+          <w:sz w:val="20"/>
+          <w:szCs w:val="20"/>
+        </w:rPr>
+        <w:t xml:space="preserve">Session tokens are self-contained and signed with </w:t>
+      </w:r>
+      <w:r>
+        <w:rPr>
+          <w:rFonts w:ascii="Consolas" w:cs="Consolas" w:eastAsia="Consolas" w:hAnsi="Consolas"/>
+          <w:color w:val="B91C1C"/>
+          <w:sz w:val="20"/>
+          <w:szCs w:val="20"/>
+          <w:shd w:fill="F1F5F9" w:val="clear"/>
+        </w:rPr>
+        <w:t xml:space="preserve">SESSION_SECRET</w:t>
+      </w:r>
+      <w:r>
+        <w:rPr>
+          <w:sz w:val="20"/>
+          <w:szCs w:val="20"/>
+        </w:rPr>
+        <w:t xml:space="preserve"> alone — anyone with that secret (server-side only, but worth being aware of) can mint a valid session for any member id and access tier without a password, since there's no server-side session store to revoke against. This is inherent to the stateless-JWT-style design, not a bug, but it means </w:t>
+      </w:r>
+      <w:r>
+        <w:rPr>
+          <w:rFonts w:ascii="Consolas" w:cs="Consolas" w:eastAsia="Consolas" w:hAnsi="Consolas"/>
+          <w:color w:val="B91C1C"/>
+          <w:sz w:val="20"/>
+          <w:szCs w:val="20"/>
+          <w:shd w:fill="F1F5F9" w:val="clear"/>
+        </w:rPr>
+        <w:t xml:space="preserve">SESSION_SECRET</w:t>
+      </w:r>
+      <w:r>
+        <w:rPr>
+          <w:sz w:val="20"/>
+          <w:szCs w:val="20"/>
+        </w:rPr>
+        <w:t xml:space="preserve"> compromise is equivalent to full account takeover for every member until it's rotated.</w:t>
       </w:r>
     </w:p>
     <w:p>

</xml_diff>